<commit_message>
Anexos C y D: pruebas H1-H4 y H6 repetidas en el Moodle real con capturas
Co-Authored-By: Claude Sonnet 5.5 <noreply@anthropic.com>
</commit_message>
<xml_diff>
--- a/anexos/4_Evidencias_Pruebas_Funcionales_Ada.docx
+++ b/anexos/4_Evidencias_Pruebas_Funcionales_Ada.docx
@@ -2686,7 +2686,7 @@
           <w:sz w:val="22"/>
           <w:szCs w:val="22"/>
         </w:rPr>
-        <w:t xml:space="preserve">Capturas de las reglas de sesión y del panel de historial. Se tomaron sobre una página de prueba que simula la sesión de Moodle (usuario y sesión intercambiables), conectada a los workflows de n8n y al bridge reales; por eso se ve el encabezado «Moodle simulado (solo pruebas)». Corresponden a las pruebas H1 a H6 del Informe de Pruebas Funcionales (Anexo C).</w:t>
+        <w:t xml:space="preserve">Capturas tomadas en el Moodle real del piloto (localhost:8080) con dos cuentas: la de administrador y una cuenta de prueba sin cursos matriculados. Corresponden a las pruebas H1 a H4 y H6 del Informe de Pruebas Funcionales (Anexo C). H5 (limpieza de la copia local al cambiar de cuenta) y H7 a H9 (purga, identificadores inválidos y contexto del modelo) se verifican en el almacenamiento del navegador y en el servidor, por lo que no tienen captura de pantalla.</w:t>
       </w:r>
     </w:p>
     <w:p>
@@ -2722,7 +2722,7 @@
           <w:sz w:val="22"/>
           <w:szCs w:val="22"/>
         </w:rPr>
-        <w:t xml:space="preserve">Mientras la sesión sea la misma, el chat en curso se conserva. Se muestran los botones de Historial (reloj) y Nueva conversación (+) en la cabecera.</w:t>
+        <w:t xml:space="preserve">Mientras la sesión de Moodle sea la misma, el chat en curso se conserva. En la cabecera se ven los botones de Historial (reloj) y Nueva conversación (+).</w:t>
       </w:r>
     </w:p>
     <w:p>
@@ -2733,7 +2733,7 @@
       <w:r>
         <w:drawing>
           <wp:inline distT="0" distB="0" distL="0" distR="0">
-            <wp:extent cx="4000500" cy="4000500"/>
+            <wp:extent cx="4000500" cy="2009775"/>
             <wp:effectExtent t="0" r="0" b="0" l="0"/>
             <wp:docPr id="20" name="" descr="" title=""/>
             <wp:cNvGraphicFramePr>
@@ -2758,7 +2758,7 @@
                   <pic:spPr bwMode="auto">
                     <a:xfrm>
                       <a:off x="0" y="0"/>
-                      <a:ext cx="4000500" cy="4000500"/>
+                      <a:ext cx="4000500" cy="2009775"/>
                     </a:xfrm>
                     <a:prstGeom prst="rect">
                       <a:avLst/>
@@ -2785,7 +2785,7 @@
           <w:sz w:val="19"/>
           <w:szCs w:val="19"/>
         </w:rPr>
-        <w:t xml:space="preserve">Chat actual de un usuario (Alice) con saludo y consulta de cursos resueltos de forma inmediata.</w:t>
+        <w:t xml:space="preserve">H1 — chat actual con la conversación en curso.</w:t>
       </w:r>
     </w:p>
     <w:p>
@@ -2802,7 +2802,7 @@
           <w:sz w:val="24"/>
           <w:szCs w:val="24"/>
         </w:rPr>
-        <w:t xml:space="preserve">Panel de historial (H2, H3, H6)</w:t>
+        <w:t xml:space="preserve">Nuevo inicio de sesión (H2)</w:t>
       </w:r>
     </w:p>
     <w:p>
@@ -2821,7 +2821,7 @@
           <w:sz w:val="22"/>
           <w:szCs w:val="22"/>
         </w:rPr>
-        <w:t xml:space="preserve">El panel lista las conversaciones anteriores del usuario, con título, fecha y número de mensajes; la actual aparece resaltada. Cada una puede retomarse (clic) o borrarse (icono de papelera), y existe un botón para borrar todo el historial. Una nota informa la purga automática a los 30 días.</w:t>
+        <w:t xml:space="preserve">Al iniciar una sesión nueva, el chat arranca vacío; las conversaciones anteriores siguen disponibles en el panel de historial, con su título, fecha y número de mensajes, y con la opción de borrar una conversación o todo el historial. Una nota informa que se eliminan automáticamente a los 30 días.</w:t>
       </w:r>
     </w:p>
     <w:p>
@@ -2832,7 +2832,7 @@
       <w:r>
         <w:drawing>
           <wp:inline distT="0" distB="0" distL="0" distR="0">
-            <wp:extent cx="4000500" cy="4000500"/>
+            <wp:extent cx="4000500" cy="2000250"/>
             <wp:effectExtent t="0" r="0" b="0" l="0"/>
             <wp:docPr id="21" name="" descr="" title=""/>
             <wp:cNvGraphicFramePr>
@@ -2857,7 +2857,7 @@
                   <pic:spPr bwMode="auto">
                     <a:xfrm>
                       <a:off x="0" y="0"/>
-                      <a:ext cx="4000500" cy="4000500"/>
+                      <a:ext cx="4000500" cy="2000250"/>
                     </a:xfrm>
                     <a:prstGeom prst="rect">
                       <a:avLst/>
@@ -2884,43 +2884,7 @@
           <w:sz w:val="19"/>
           <w:szCs w:val="19"/>
         </w:rPr>
-        <w:t xml:space="preserve">Panel de historial con cuatro conversaciones del usuario (la más reciente marcada como actual).</w:t>
-      </w:r>
-    </w:p>
-    <w:p>
-      <w:pPr>
-        <w:pStyle w:val="Heading2"/>
-        <w:spacing w:after="140" w:before="320"/>
-      </w:pPr>
-      <w:r>
-        <w:rPr>
-          <w:rFonts w:ascii="Calibri" w:cs="Calibri" w:eastAsia="Calibri" w:hAnsi="Calibri"/>
-          <w:b/>
-          <w:bCs/>
-          <w:color w:val="4E95C2"/>
-          <w:sz w:val="24"/>
-          <w:szCs w:val="24"/>
-        </w:rPr>
-        <w:t xml:space="preserve">Nuevo inicio de sesión (H2)</w:t>
-      </w:r>
-    </w:p>
-    <w:p>
-      <w:pPr>
-        <w:spacing w:after="160" w:line="288"/>
-        <w:jc w:val="both"/>
-      </w:pPr>
-      <w:r>
-        <w:rPr>
-          <w:rFonts w:ascii="Calibri" w:cs="Calibri" w:eastAsia="Calibri" w:hAnsi="Calibri"/>
-          <w:b w:val="false"/>
-          <w:bCs w:val="false"/>
-          <w:i w:val="false"/>
-          <w:iCs w:val="false"/>
-          <w:color w:val="222222"/>
-          <w:sz w:val="22"/>
-          <w:szCs w:val="22"/>
-        </w:rPr>
-        <w:t xml:space="preserve">Al iniciar una sesión nueva, el chat arranca vacío; la conversación anterior sigue disponible en el historial.</w:t>
+        <w:t xml:space="preserve">H2 — sesión nueva: el chat arranca vacío.</w:t>
       </w:r>
     </w:p>
     <w:p>
@@ -2931,7 +2895,7 @@
       <w:r>
         <w:drawing>
           <wp:inline distT="0" distB="0" distL="0" distR="0">
-            <wp:extent cx="4000500" cy="4000500"/>
+            <wp:extent cx="4000500" cy="2000250"/>
             <wp:effectExtent t="0" r="0" b="0" l="0"/>
             <wp:docPr id="22" name="" descr="" title=""/>
             <wp:cNvGraphicFramePr>
@@ -2956,7 +2920,7 @@
                   <pic:spPr bwMode="auto">
                     <a:xfrm>
                       <a:off x="0" y="0"/>
-                      <a:ext cx="4000500" cy="4000500"/>
+                      <a:ext cx="4000500" cy="2000250"/>
                     </a:xfrm>
                     <a:prstGeom prst="rect">
                       <a:avLst/>
@@ -2983,7 +2947,43 @@
           <w:sz w:val="19"/>
           <w:szCs w:val="19"/>
         </w:rPr>
-        <w:t xml:space="preserve">Sesión 2 del mismo usuario: chat vacío.</w:t>
+        <w:t xml:space="preserve">H2 — el historial conserva las conversaciones de las sesiones anteriores.</w:t>
+      </w:r>
+    </w:p>
+    <w:p>
+      <w:pPr>
+        <w:pStyle w:val="Heading2"/>
+        <w:spacing w:after="140" w:before="320"/>
+      </w:pPr>
+      <w:r>
+        <w:rPr>
+          <w:rFonts w:ascii="Calibri" w:cs="Calibri" w:eastAsia="Calibri" w:hAnsi="Calibri"/>
+          <w:b/>
+          <w:bCs/>
+          <w:color w:val="4E95C2"/>
+          <w:sz w:val="24"/>
+          <w:szCs w:val="24"/>
+        </w:rPr>
+        <w:t xml:space="preserve">Retomar una conversación (H3)</w:t>
+      </w:r>
+    </w:p>
+    <w:p>
+      <w:pPr>
+        <w:spacing w:after="160" w:line="288"/>
+        <w:jc w:val="both"/>
+      </w:pPr>
+      <w:r>
+        <w:rPr>
+          <w:rFonts w:ascii="Calibri" w:cs="Calibri" w:eastAsia="Calibri" w:hAnsi="Calibri"/>
+          <w:b w:val="false"/>
+          <w:bCs w:val="false"/>
+          <w:i w:val="false"/>
+          <w:iCs w:val="false"/>
+          <w:color w:val="222222"/>
+          <w:sz w:val="22"/>
+          <w:szCs w:val="22"/>
+        </w:rPr>
+        <w:t xml:space="preserve">Al elegir una conversación del historial, se restauran sus mensajes y pasa a ser la conversación actual.</w:t>
       </w:r>
     </w:p>
     <w:p>
@@ -2994,7 +2994,7 @@
       <w:r>
         <w:drawing>
           <wp:inline distT="0" distB="0" distL="0" distR="0">
-            <wp:extent cx="4000500" cy="4000500"/>
+            <wp:extent cx="4000500" cy="2009775"/>
             <wp:effectExtent t="0" r="0" b="0" l="0"/>
             <wp:docPr id="23" name="" descr="" title=""/>
             <wp:cNvGraphicFramePr>
@@ -3019,7 +3019,7 @@
                   <pic:spPr bwMode="auto">
                     <a:xfrm>
                       <a:off x="0" y="0"/>
-                      <a:ext cx="4000500" cy="4000500"/>
+                      <a:ext cx="4000500" cy="2009775"/>
                     </a:xfrm>
                     <a:prstGeom prst="rect">
                       <a:avLst/>
@@ -3046,32 +3046,24 @@
           <w:sz w:val="19"/>
           <w:szCs w:val="19"/>
         </w:rPr>
-        <w:t xml:space="preserve">Sesión 2: el historial conserva las conversaciones de la sesión anterior.</w:t>
-      </w:r>
-    </w:p>
-    <w:p>
-      <w:pPr>
-        <w:pageBreakBefore/>
-      </w:pPr>
-    </w:p>
-    <w:p>
-      <w:pPr>
-        <w:pStyle w:val="Heading1"/>
-        <w:pBdr>
-          <w:bottom w:val="single" w:color="D98E3A" w:sz="6" w:space="4"/>
-        </w:pBdr>
-        <w:spacing w:after="200" w:before="480"/>
-      </w:pPr>
-      <w:r>
-        <w:rPr>
-          <w:rFonts w:ascii="Calibri" w:cs="Calibri" w:eastAsia="Calibri" w:hAnsi="Calibri"/>
-          <w:b/>
-          <w:bCs/>
-          <w:color w:val="24425E"/>
-          <w:sz w:val="30"/>
-          <w:szCs w:val="30"/>
-        </w:rPr>
-        <w:t xml:space="preserve">8. Búsqueda por tema y enlaces (catálogo ampliado)</w:t>
+        <w:t xml:space="preserve">H3 — conversación «hola» retomada desde el historial.</w:t>
+      </w:r>
+    </w:p>
+    <w:p>
+      <w:pPr>
+        <w:pStyle w:val="Heading2"/>
+        <w:spacing w:after="140" w:before="320"/>
+      </w:pPr>
+      <w:r>
+        <w:rPr>
+          <w:rFonts w:ascii="Calibri" w:cs="Calibri" w:eastAsia="Calibri" w:hAnsi="Calibri"/>
+          <w:b/>
+          <w:bCs/>
+          <w:color w:val="4E95C2"/>
+          <w:sz w:val="24"/>
+          <w:szCs w:val="24"/>
+        </w:rPr>
+        <w:t xml:space="preserve">Aislamiento entre usuarios (H4)</w:t>
       </w:r>
     </w:p>
     <w:p>
@@ -3090,43 +3082,7 @@
           <w:sz w:val="22"/>
           <w:szCs w:val="22"/>
         </w:rPr>
-        <w:t xml:space="preserve">Capturas de las respuestas de Ada con un catálogo de 1.002 cursos (2 reales y 1.000 sintéticos de prueba), en la misma página de prueba que simula la sesión de Moodle. Corresponden a los casos B1 a B14 del Anexo C (sección 8).</w:t>
-      </w:r>
-    </w:p>
-    <w:p>
-      <w:pPr>
-        <w:pStyle w:val="Heading2"/>
-        <w:spacing w:after="140" w:before="320"/>
-      </w:pPr>
-      <w:r>
-        <w:rPr>
-          <w:rFonts w:ascii="Calibri" w:cs="Calibri" w:eastAsia="Calibri" w:hAnsi="Calibri"/>
-          <w:b/>
-          <w:bCs/>
-          <w:color w:val="4E95C2"/>
-          <w:sz w:val="24"/>
-          <w:szCs w:val="24"/>
-        </w:rPr>
-        <w:t xml:space="preserve">Mediciones en el Moodle real (comparación manual vs Ada)</w:t>
-      </w:r>
-    </w:p>
-    <w:p>
-      <w:pPr>
-        <w:spacing w:after="160" w:line="288"/>
-        <w:jc w:val="both"/>
-      </w:pPr>
-      <w:r>
-        <w:rPr>
-          <w:rFonts w:ascii="Calibri" w:cs="Calibri" w:eastAsia="Calibri" w:hAnsi="Calibri"/>
-          <w:b w:val="false"/>
-          <w:bCs w:val="false"/>
-          <w:i w:val="false"/>
-          <w:iCs w:val="false"/>
-          <w:color w:val="222222"/>
-          <w:sz w:val="22"/>
-          <w:szCs w:val="22"/>
-        </w:rPr>
-        <w:t xml:space="preserve">Capturas tomadas en el Moodle real (localhost:8080) con el catálogo de 1.002 cursos durante las mediciones del Anexo C (sección 8). Las tres tareas se repitieron con las mismas frases; las capturas corresponden a una de las repeticiones.</w:t>
+        <w:t xml:space="preserve">Con la cuenta de administrador el historial muestra sus conversaciones. Al iniciar sesión con otra cuenta, el panel aparece vacío (sin ninguna conversación del administrador) y, tras escribir un mensaje, solo muestra la conversación propia.</w:t>
       </w:r>
     </w:p>
     <w:p>
@@ -3137,7 +3093,7 @@
       <w:r>
         <w:drawing>
           <wp:inline distT="0" distB="0" distL="0" distR="0">
-            <wp:extent cx="4000500" cy="2019300"/>
+            <wp:extent cx="4000500" cy="2000250"/>
             <wp:effectExtent t="0" r="0" b="0" l="0"/>
             <wp:docPr id="24" name="" descr="" title=""/>
             <wp:cNvGraphicFramePr>
@@ -3162,7 +3118,7 @@
                   <pic:spPr bwMode="auto">
                     <a:xfrm>
                       <a:off x="0" y="0"/>
-                      <a:ext cx="4000500" cy="2019300"/>
+                      <a:ext cx="4000500" cy="2000250"/>
                     </a:xfrm>
                     <a:prstGeom prst="rect">
                       <a:avLst/>
@@ -3189,7 +3145,7 @@
           <w:sz w:val="19"/>
           <w:szCs w:val="19"/>
         </w:rPr>
-        <w:t xml:space="preserve">Tarea 1: «¿tienen cursos sobre fotosíntesis?» → 20 cursos con enlace.</w:t>
+        <w:t xml:space="preserve">H4 — historial de la cuenta de administrador.</w:t>
       </w:r>
     </w:p>
     <w:p>
@@ -3200,7 +3156,7 @@
       <w:r>
         <w:drawing>
           <wp:inline distT="0" distB="0" distL="0" distR="0">
-            <wp:extent cx="4000500" cy="2019300"/>
+            <wp:extent cx="4000500" cy="2000250"/>
             <wp:effectExtent t="0" r="0" b="0" l="0"/>
             <wp:docPr id="25" name="" descr="" title=""/>
             <wp:cNvGraphicFramePr>
@@ -3225,7 +3181,7 @@
                   <pic:spPr bwMode="auto">
                     <a:xfrm>
                       <a:off x="0" y="0"/>
-                      <a:ext cx="4000500" cy="2019300"/>
+                      <a:ext cx="4000500" cy="2000250"/>
                     </a:xfrm>
                     <a:prstGeom prst="rect">
                       <a:avLst/>
@@ -3252,7 +3208,7 @@
           <w:sz w:val="19"/>
           <w:szCs w:val="19"/>
         </w:rPr>
-        <w:t xml:space="preserve">Tarea 2: «hay cursos sobre lectura critica» → Lectura Crítica — Saber 11 aparece primero, con enlace.</w:t>
+        <w:t xml:space="preserve">H4 — otra cuenta: «Aún no tienes conversaciones anteriores».</w:t>
       </w:r>
     </w:p>
     <w:p>
@@ -3263,7 +3219,7 @@
       <w:r>
         <w:drawing>
           <wp:inline distT="0" distB="0" distL="0" distR="0">
-            <wp:extent cx="4000500" cy="2000250"/>
+            <wp:extent cx="4000500" cy="2009775"/>
             <wp:effectExtent t="0" r="0" b="0" l="0"/>
             <wp:docPr id="26" name="" descr="" title=""/>
             <wp:cNvGraphicFramePr>
@@ -3288,7 +3244,7 @@
                   <pic:spPr bwMode="auto">
                     <a:xfrm>
                       <a:off x="0" y="0"/>
-                      <a:ext cx="4000500" cy="2000250"/>
+                      <a:ext cx="4000500" cy="2009775"/>
                     </a:xfrm>
                     <a:prstGeom prst="rect">
                       <a:avLst/>
@@ -3315,7 +3271,24 @@
           <w:sz w:val="19"/>
           <w:szCs w:val="19"/>
         </w:rPr>
-        <w:t xml:space="preserve">Tarea 3: «¿Cuántas unidades tiene ciencias naturales?» → 4 unidades con sus porcentajes.</w:t>
+        <w:t xml:space="preserve">H4 — otra cuenta: el historial solo contiene su propia conversación.</w:t>
+      </w:r>
+    </w:p>
+    <w:p>
+      <w:pPr>
+        <w:pStyle w:val="Heading2"/>
+        <w:spacing w:after="140" w:before="320"/>
+      </w:pPr>
+      <w:r>
+        <w:rPr>
+          <w:rFonts w:ascii="Calibri" w:cs="Calibri" w:eastAsia="Calibri" w:hAnsi="Calibri"/>
+          <w:b/>
+          <w:bCs/>
+          <w:color w:val="4E95C2"/>
+          <w:sz w:val="24"/>
+          <w:szCs w:val="24"/>
+        </w:rPr>
+        <w:t xml:space="preserve">Borrar una conversación (H6)</w:t>
       </w:r>
     </w:p>
     <w:p>
@@ -3334,43 +3307,7 @@
           <w:sz w:val="22"/>
           <w:szCs w:val="22"/>
         </w:rPr>
-        <w:t xml:space="preserve">Las capturas siguientes provienen de la página de prueba que simula la sesión de Moodle.</w:t>
-      </w:r>
-    </w:p>
-    <w:p>
-      <w:pPr>
-        <w:pStyle w:val="Heading2"/>
-        <w:spacing w:after="140" w:before="320"/>
-      </w:pPr>
-      <w:r>
-        <w:rPr>
-          <w:rFonts w:ascii="Calibri" w:cs="Calibri" w:eastAsia="Calibri" w:hAnsi="Calibri"/>
-          <w:b/>
-          <w:bCs/>
-          <w:color w:val="4E95C2"/>
-          <w:sz w:val="24"/>
-          <w:szCs w:val="24"/>
-        </w:rPr>
-        <w:t xml:space="preserve">Búsqueda por tema con enlaces (B1)</w:t>
-      </w:r>
-    </w:p>
-    <w:p>
-      <w:pPr>
-        <w:spacing w:after="160" w:line="288"/>
-        <w:jc w:val="both"/>
-      </w:pPr>
-      <w:r>
-        <w:rPr>
-          <w:rFonts w:ascii="Calibri" w:cs="Calibri" w:eastAsia="Calibri" w:hAnsi="Calibri"/>
-          <w:b w:val="false"/>
-          <w:bCs w:val="false"/>
-          <w:i w:val="false"/>
-          <w:iCs w:val="false"/>
-          <w:color w:val="222222"/>
-          <w:sz w:val="22"/>
-          <w:szCs w:val="22"/>
-        </w:rPr>
-        <w:t xml:space="preserve">La consulta «¿qué cursos ofreces sobre átomos?» entrega los cursos más relevantes con su enlace («Abrir curso») y el total de coincidencias (32), que coincide con la verificación independiente en la base de datos.</w:t>
+        <w:t xml:space="preserve">Al pulsar el icono de la papelera, el widget pide confirmación («Esta acción no se puede deshacer»); tras aceptar, la conversación desaparece del historial y del servidor.</w:t>
       </w:r>
     </w:p>
     <w:p>
@@ -3381,7 +3318,7 @@
       <w:r>
         <w:drawing>
           <wp:inline distT="0" distB="0" distL="0" distR="0">
-            <wp:extent cx="4000500" cy="4524375"/>
+            <wp:extent cx="4000500" cy="2009775"/>
             <wp:effectExtent t="0" r="0" b="0" l="0"/>
             <wp:docPr id="27" name="" descr="" title=""/>
             <wp:cNvGraphicFramePr>
@@ -3406,7 +3343,7 @@
                   <pic:spPr bwMode="auto">
                     <a:xfrm>
                       <a:off x="0" y="0"/>
-                      <a:ext cx="4000500" cy="4524375"/>
+                      <a:ext cx="4000500" cy="2009775"/>
                     </a:xfrm>
                     <a:prstGeom prst="rect">
                       <a:avLst/>
@@ -3433,43 +3370,7 @@
           <w:sz w:val="19"/>
           <w:szCs w:val="19"/>
         </w:rPr>
-        <w:t xml:space="preserve">Búsqueda por tema: 32 cursos que tratan «átomo», con enlace a cada curso.</w:t>
-      </w:r>
-    </w:p>
-    <w:p>
-      <w:pPr>
-        <w:pStyle w:val="Heading2"/>
-        <w:spacing w:after="140" w:before="320"/>
-      </w:pPr>
-      <w:r>
-        <w:rPr>
-          <w:rFonts w:ascii="Calibri" w:cs="Calibri" w:eastAsia="Calibri" w:hAnsi="Calibri"/>
-          <w:b/>
-          <w:bCs/>
-          <w:color w:val="4E95C2"/>
-          <w:sz w:val="24"/>
-          <w:szCs w:val="24"/>
-        </w:rPr>
-        <w:t xml:space="preserve">Conversación de varios turnos (B10)</w:t>
-      </w:r>
-    </w:p>
-    <w:p>
-      <w:pPr>
-        <w:spacing w:after="160" w:line="288"/>
-        <w:jc w:val="both"/>
-      </w:pPr>
-      <w:r>
-        <w:rPr>
-          <w:rFonts w:ascii="Calibri" w:cs="Calibri" w:eastAsia="Calibri" w:hAnsi="Calibri"/>
-          <w:b w:val="false"/>
-          <w:bCs w:val="false"/>
-          <w:i w:val="false"/>
-          <w:iCs w:val="false"/>
-          <w:color w:val="222222"/>
-          <w:sz w:val="22"/>
-          <w:szCs w:val="22"/>
-        </w:rPr>
-        <w:t xml:space="preserve">La conversación que originalmente falló: se pide el tema, el estudiante insiste y luego solicita el enlace. Ada mantiene el tema y entrega los enlaces de los cursos mostrados.</w:t>
+        <w:t xml:space="preserve">H6 — confirmación antes de borrar la conversación «hola».</w:t>
       </w:r>
     </w:p>
     <w:p>
@@ -3480,7 +3381,7 @@
       <w:r>
         <w:drawing>
           <wp:inline distT="0" distB="0" distL="0" distR="0">
-            <wp:extent cx="4000500" cy="4524375"/>
+            <wp:extent cx="4000500" cy="2009775"/>
             <wp:effectExtent t="0" r="0" b="0" l="0"/>
             <wp:docPr id="28" name="" descr="" title=""/>
             <wp:cNvGraphicFramePr>
@@ -3505,7 +3406,7 @@
                   <pic:spPr bwMode="auto">
                     <a:xfrm>
                       <a:off x="0" y="0"/>
-                      <a:ext cx="4000500" cy="4524375"/>
+                      <a:ext cx="4000500" cy="2009775"/>
                     </a:xfrm>
                     <a:prstGeom prst="rect">
                       <a:avLst/>
@@ -3532,24 +3433,32 @@
           <w:sz w:val="19"/>
           <w:szCs w:val="19"/>
         </w:rPr>
-        <w:t xml:space="preserve">Conversación: tema, insistencia y solicitud de enlace; la respuesta trae los enlaces clicables.</w:t>
-      </w:r>
-    </w:p>
-    <w:p>
-      <w:pPr>
-        <w:pStyle w:val="Heading2"/>
-        <w:spacing w:after="140" w:before="320"/>
-      </w:pPr>
-      <w:r>
-        <w:rPr>
-          <w:rFonts w:ascii="Calibri" w:cs="Calibri" w:eastAsia="Calibri" w:hAnsi="Calibri"/>
-          <w:b/>
-          <w:bCs/>
-          <w:color w:val="4E95C2"/>
-          <w:sz w:val="24"/>
-          <w:szCs w:val="24"/>
-        </w:rPr>
-        <w:t xml:space="preserve">Catálogo grande y detalle de un curso (B12, B13)</w:t>
+        <w:t xml:space="preserve">H6 — la conversación borrada ya no aparece en el historial.</w:t>
+      </w:r>
+    </w:p>
+    <w:p>
+      <w:pPr>
+        <w:pageBreakBefore/>
+      </w:pPr>
+    </w:p>
+    <w:p>
+      <w:pPr>
+        <w:pStyle w:val="Heading1"/>
+        <w:pBdr>
+          <w:bottom w:val="single" w:color="D98E3A" w:sz="6" w:space="4"/>
+        </w:pBdr>
+        <w:spacing w:after="200" w:before="480"/>
+      </w:pPr>
+      <w:r>
+        <w:rPr>
+          <w:rFonts w:ascii="Calibri" w:cs="Calibri" w:eastAsia="Calibri" w:hAnsi="Calibri"/>
+          <w:b/>
+          <w:bCs/>
+          <w:color w:val="24425E"/>
+          <w:sz w:val="30"/>
+          <w:szCs w:val="30"/>
+        </w:rPr>
+        <w:t xml:space="preserve">8. Búsqueda por tema y enlaces (catálogo ampliado)</w:t>
       </w:r>
     </w:p>
     <w:p>
@@ -3568,7 +3477,43 @@
           <w:sz w:val="22"/>
           <w:szCs w:val="22"/>
         </w:rPr>
-        <w:t xml:space="preserve">Con 1.002 cursos, el listado muestra el total y las categorías en lugar de listar todos los cursos; el detalle de un curso conserva las unidades, los pesos y agrega el enlace.</w:t>
+        <w:t xml:space="preserve">Capturas de las respuestas de Ada con un catálogo de 1.002 cursos (2 reales y 1.000 sintéticos de prueba), en la misma página de prueba que simula la sesión de Moodle. Corresponden a los casos B1 a B14 del Anexo C (sección 8).</w:t>
+      </w:r>
+    </w:p>
+    <w:p>
+      <w:pPr>
+        <w:pStyle w:val="Heading2"/>
+        <w:spacing w:after="140" w:before="320"/>
+      </w:pPr>
+      <w:r>
+        <w:rPr>
+          <w:rFonts w:ascii="Calibri" w:cs="Calibri" w:eastAsia="Calibri" w:hAnsi="Calibri"/>
+          <w:b/>
+          <w:bCs/>
+          <w:color w:val="4E95C2"/>
+          <w:sz w:val="24"/>
+          <w:szCs w:val="24"/>
+        </w:rPr>
+        <w:t xml:space="preserve">Mediciones en el Moodle real (comparación manual vs Ada)</w:t>
+      </w:r>
+    </w:p>
+    <w:p>
+      <w:pPr>
+        <w:spacing w:after="160" w:line="288"/>
+        <w:jc w:val="both"/>
+      </w:pPr>
+      <w:r>
+        <w:rPr>
+          <w:rFonts w:ascii="Calibri" w:cs="Calibri" w:eastAsia="Calibri" w:hAnsi="Calibri"/>
+          <w:b w:val="false"/>
+          <w:bCs w:val="false"/>
+          <w:i w:val="false"/>
+          <w:iCs w:val="false"/>
+          <w:color w:val="222222"/>
+          <w:sz w:val="22"/>
+          <w:szCs w:val="22"/>
+        </w:rPr>
+        <w:t xml:space="preserve">Capturas tomadas en el Moodle real (localhost:8080) con el catálogo de 1.002 cursos durante las mediciones del Anexo C (sección 8). Las tres tareas se repitieron con las mismas frases; las capturas corresponden a una de las repeticiones.</w:t>
       </w:r>
     </w:p>
     <w:p>
@@ -3579,7 +3524,7 @@
       <w:r>
         <w:drawing>
           <wp:inline distT="0" distB="0" distL="0" distR="0">
-            <wp:extent cx="4000500" cy="4524375"/>
+            <wp:extent cx="4000500" cy="2019300"/>
             <wp:effectExtent t="0" r="0" b="0" l="0"/>
             <wp:docPr id="29" name="" descr="" title=""/>
             <wp:cNvGraphicFramePr>
@@ -3604,7 +3549,7 @@
                   <pic:spPr bwMode="auto">
                     <a:xfrm>
                       <a:off x="0" y="0"/>
-                      <a:ext cx="4000500" cy="4524375"/>
+                      <a:ext cx="4000500" cy="2019300"/>
                     </a:xfrm>
                     <a:prstGeom prst="rect">
                       <a:avLst/>
@@ -3631,43 +3576,7 @@
           <w:sz w:val="19"/>
           <w:szCs w:val="19"/>
         </w:rPr>
-        <w:t xml:space="preserve">Panorama del catálogo (1.002 cursos, 18 categorías) y detalle de Ciencias Naturales.</w:t>
-      </w:r>
-    </w:p>
-    <w:p>
-      <w:pPr>
-        <w:pStyle w:val="Heading2"/>
-        <w:spacing w:after="140" w:before="320"/>
-      </w:pPr>
-      <w:r>
-        <w:rPr>
-          <w:rFonts w:ascii="Calibri" w:cs="Calibri" w:eastAsia="Calibri" w:hAnsi="Calibri"/>
-          <w:b/>
-          <w:bCs/>
-          <w:color w:val="4E95C2"/>
-          <w:sz w:val="24"/>
-          <w:szCs w:val="24"/>
-        </w:rPr>
-        <w:t xml:space="preserve">Tema inexistente (B6)</w:t>
-      </w:r>
-    </w:p>
-    <w:p>
-      <w:pPr>
-        <w:spacing w:after="160" w:line="288"/>
-        <w:jc w:val="both"/>
-      </w:pPr>
-      <w:r>
-        <w:rPr>
-          <w:rFonts w:ascii="Calibri" w:cs="Calibri" w:eastAsia="Calibri" w:hAnsi="Calibri"/>
-          <w:b w:val="false"/>
-          <w:bCs w:val="false"/>
-          <w:i w:val="false"/>
-          <w:iCs w:val="false"/>
-          <w:color w:val="222222"/>
-          <w:sz w:val="22"/>
-          <w:szCs w:val="22"/>
-        </w:rPr>
-        <w:t xml:space="preserve">Ante un tema que no existe en el catálogo, Ada informa que no encontró coincidencias en vez de inventar cursos.</w:t>
+        <w:t xml:space="preserve">Tarea 1: «¿tienen cursos sobre fotosíntesis?» → 20 cursos con enlace.</w:t>
       </w:r>
     </w:p>
     <w:p>
@@ -3678,7 +3587,7 @@
       <w:r>
         <w:drawing>
           <wp:inline distT="0" distB="0" distL="0" distR="0">
-            <wp:extent cx="4000500" cy="4524375"/>
+            <wp:extent cx="4000500" cy="2019300"/>
             <wp:effectExtent t="0" r="0" b="0" l="0"/>
             <wp:docPr id="30" name="" descr="" title=""/>
             <wp:cNvGraphicFramePr>
@@ -3695,6 +3604,484 @@
                   </pic:nvPicPr>
                   <pic:blipFill>
                     <a:blip r:embed="rId38" cstate="none"/>
+                    <a:srcRect/>
+                    <a:stretch>
+                      <a:fillRect/>
+                    </a:stretch>
+                  </pic:blipFill>
+                  <pic:spPr bwMode="auto">
+                    <a:xfrm>
+                      <a:off x="0" y="0"/>
+                      <a:ext cx="4000500" cy="2019300"/>
+                    </a:xfrm>
+                    <a:prstGeom prst="rect">
+                      <a:avLst/>
+                    </a:prstGeom>
+                  </pic:spPr>
+                </pic:pic>
+              </a:graphicData>
+            </a:graphic>
+          </wp:inline>
+        </w:drawing>
+      </w:r>
+    </w:p>
+    <w:p>
+      <w:pPr>
+        <w:spacing w:after="220"/>
+        <w:jc w:val="center"/>
+      </w:pPr>
+      <w:r>
+        <w:rPr>
+          <w:rFonts w:ascii="Calibri" w:cs="Calibri" w:eastAsia="Calibri" w:hAnsi="Calibri"/>
+          <w:i/>
+          <w:iCs/>
+          <w:color w:val="6B7A82"/>
+          <w:sz w:val="19"/>
+          <w:szCs w:val="19"/>
+        </w:rPr>
+        <w:t xml:space="preserve">Tarea 2: «hay cursos sobre lectura critica» → Lectura Crítica — Saber 11 aparece primero, con enlace.</w:t>
+      </w:r>
+    </w:p>
+    <w:p>
+      <w:pPr>
+        <w:spacing w:after="60" w:before="160"/>
+        <w:jc w:val="center"/>
+      </w:pPr>
+      <w:r>
+        <w:drawing>
+          <wp:inline distT="0" distB="0" distL="0" distR="0">
+            <wp:extent cx="4000500" cy="2000250"/>
+            <wp:effectExtent t="0" r="0" b="0" l="0"/>
+            <wp:docPr id="31" name="" descr="" title=""/>
+            <wp:cNvGraphicFramePr>
+              <a:graphicFrameLocks xmlns:a="http://schemas.openxmlformats.org/drawingml/2006/main" noChangeAspect="1"/>
+            </wp:cNvGraphicFramePr>
+            <a:graphic xmlns:a="http://schemas.openxmlformats.org/drawingml/2006/main">
+              <a:graphicData uri="http://schemas.openxmlformats.org/drawingml/2006/picture">
+                <pic:pic xmlns:pic="http://schemas.openxmlformats.org/drawingml/2006/picture">
+                  <pic:nvPicPr>
+                    <pic:cNvPr id="0" name="" descr=""/>
+                    <pic:cNvPicPr>
+                      <a:picLocks noChangeAspect="1" noChangeArrowheads="1"/>
+                    </pic:cNvPicPr>
+                  </pic:nvPicPr>
+                  <pic:blipFill>
+                    <a:blip r:embed="rId39" cstate="none"/>
+                    <a:srcRect/>
+                    <a:stretch>
+                      <a:fillRect/>
+                    </a:stretch>
+                  </pic:blipFill>
+                  <pic:spPr bwMode="auto">
+                    <a:xfrm>
+                      <a:off x="0" y="0"/>
+                      <a:ext cx="4000500" cy="2000250"/>
+                    </a:xfrm>
+                    <a:prstGeom prst="rect">
+                      <a:avLst/>
+                    </a:prstGeom>
+                  </pic:spPr>
+                </pic:pic>
+              </a:graphicData>
+            </a:graphic>
+          </wp:inline>
+        </w:drawing>
+      </w:r>
+    </w:p>
+    <w:p>
+      <w:pPr>
+        <w:spacing w:after="220"/>
+        <w:jc w:val="center"/>
+      </w:pPr>
+      <w:r>
+        <w:rPr>
+          <w:rFonts w:ascii="Calibri" w:cs="Calibri" w:eastAsia="Calibri" w:hAnsi="Calibri"/>
+          <w:i/>
+          <w:iCs/>
+          <w:color w:val="6B7A82"/>
+          <w:sz w:val="19"/>
+          <w:szCs w:val="19"/>
+        </w:rPr>
+        <w:t xml:space="preserve">Tarea 3: «¿Cuántas unidades tiene ciencias naturales?» → 4 unidades con sus porcentajes.</w:t>
+      </w:r>
+    </w:p>
+    <w:p>
+      <w:pPr>
+        <w:spacing w:after="160" w:line="288"/>
+        <w:jc w:val="both"/>
+      </w:pPr>
+      <w:r>
+        <w:rPr>
+          <w:rFonts w:ascii="Calibri" w:cs="Calibri" w:eastAsia="Calibri" w:hAnsi="Calibri"/>
+          <w:b w:val="false"/>
+          <w:bCs w:val="false"/>
+          <w:i w:val="false"/>
+          <w:iCs w:val="false"/>
+          <w:color w:val="222222"/>
+          <w:sz w:val="22"/>
+          <w:szCs w:val="22"/>
+        </w:rPr>
+        <w:t xml:space="preserve">Las capturas siguientes provienen de la página de prueba que simula la sesión de Moodle.</w:t>
+      </w:r>
+    </w:p>
+    <w:p>
+      <w:pPr>
+        <w:pStyle w:val="Heading2"/>
+        <w:spacing w:after="140" w:before="320"/>
+      </w:pPr>
+      <w:r>
+        <w:rPr>
+          <w:rFonts w:ascii="Calibri" w:cs="Calibri" w:eastAsia="Calibri" w:hAnsi="Calibri"/>
+          <w:b/>
+          <w:bCs/>
+          <w:color w:val="4E95C2"/>
+          <w:sz w:val="24"/>
+          <w:szCs w:val="24"/>
+        </w:rPr>
+        <w:t xml:space="preserve">Búsqueda por tema con enlaces (B1)</w:t>
+      </w:r>
+    </w:p>
+    <w:p>
+      <w:pPr>
+        <w:spacing w:after="160" w:line="288"/>
+        <w:jc w:val="both"/>
+      </w:pPr>
+      <w:r>
+        <w:rPr>
+          <w:rFonts w:ascii="Calibri" w:cs="Calibri" w:eastAsia="Calibri" w:hAnsi="Calibri"/>
+          <w:b w:val="false"/>
+          <w:bCs w:val="false"/>
+          <w:i w:val="false"/>
+          <w:iCs w:val="false"/>
+          <w:color w:val="222222"/>
+          <w:sz w:val="22"/>
+          <w:szCs w:val="22"/>
+        </w:rPr>
+        <w:t xml:space="preserve">La consulta «¿qué cursos ofreces sobre átomos?» entrega los cursos más relevantes con su enlace («Abrir curso») y el total de coincidencias (32), que coincide con la verificación independiente en la base de datos.</w:t>
+      </w:r>
+    </w:p>
+    <w:p>
+      <w:pPr>
+        <w:spacing w:after="60" w:before="160"/>
+        <w:jc w:val="center"/>
+      </w:pPr>
+      <w:r>
+        <w:drawing>
+          <wp:inline distT="0" distB="0" distL="0" distR="0">
+            <wp:extent cx="4000500" cy="4524375"/>
+            <wp:effectExtent t="0" r="0" b="0" l="0"/>
+            <wp:docPr id="32" name="" descr="" title=""/>
+            <wp:cNvGraphicFramePr>
+              <a:graphicFrameLocks xmlns:a="http://schemas.openxmlformats.org/drawingml/2006/main" noChangeAspect="1"/>
+            </wp:cNvGraphicFramePr>
+            <a:graphic xmlns:a="http://schemas.openxmlformats.org/drawingml/2006/main">
+              <a:graphicData uri="http://schemas.openxmlformats.org/drawingml/2006/picture">
+                <pic:pic xmlns:pic="http://schemas.openxmlformats.org/drawingml/2006/picture">
+                  <pic:nvPicPr>
+                    <pic:cNvPr id="0" name="" descr=""/>
+                    <pic:cNvPicPr>
+                      <a:picLocks noChangeAspect="1" noChangeArrowheads="1"/>
+                    </pic:cNvPicPr>
+                  </pic:nvPicPr>
+                  <pic:blipFill>
+                    <a:blip r:embed="rId40" cstate="none"/>
+                    <a:srcRect/>
+                    <a:stretch>
+                      <a:fillRect/>
+                    </a:stretch>
+                  </pic:blipFill>
+                  <pic:spPr bwMode="auto">
+                    <a:xfrm>
+                      <a:off x="0" y="0"/>
+                      <a:ext cx="4000500" cy="4524375"/>
+                    </a:xfrm>
+                    <a:prstGeom prst="rect">
+                      <a:avLst/>
+                    </a:prstGeom>
+                  </pic:spPr>
+                </pic:pic>
+              </a:graphicData>
+            </a:graphic>
+          </wp:inline>
+        </w:drawing>
+      </w:r>
+    </w:p>
+    <w:p>
+      <w:pPr>
+        <w:spacing w:after="220"/>
+        <w:jc w:val="center"/>
+      </w:pPr>
+      <w:r>
+        <w:rPr>
+          <w:rFonts w:ascii="Calibri" w:cs="Calibri" w:eastAsia="Calibri" w:hAnsi="Calibri"/>
+          <w:i/>
+          <w:iCs/>
+          <w:color w:val="6B7A82"/>
+          <w:sz w:val="19"/>
+          <w:szCs w:val="19"/>
+        </w:rPr>
+        <w:t xml:space="preserve">Búsqueda por tema: 32 cursos que tratan «átomo», con enlace a cada curso.</w:t>
+      </w:r>
+    </w:p>
+    <w:p>
+      <w:pPr>
+        <w:pStyle w:val="Heading2"/>
+        <w:spacing w:after="140" w:before="320"/>
+      </w:pPr>
+      <w:r>
+        <w:rPr>
+          <w:rFonts w:ascii="Calibri" w:cs="Calibri" w:eastAsia="Calibri" w:hAnsi="Calibri"/>
+          <w:b/>
+          <w:bCs/>
+          <w:color w:val="4E95C2"/>
+          <w:sz w:val="24"/>
+          <w:szCs w:val="24"/>
+        </w:rPr>
+        <w:t xml:space="preserve">Conversación de varios turnos (B10)</w:t>
+      </w:r>
+    </w:p>
+    <w:p>
+      <w:pPr>
+        <w:spacing w:after="160" w:line="288"/>
+        <w:jc w:val="both"/>
+      </w:pPr>
+      <w:r>
+        <w:rPr>
+          <w:rFonts w:ascii="Calibri" w:cs="Calibri" w:eastAsia="Calibri" w:hAnsi="Calibri"/>
+          <w:b w:val="false"/>
+          <w:bCs w:val="false"/>
+          <w:i w:val="false"/>
+          <w:iCs w:val="false"/>
+          <w:color w:val="222222"/>
+          <w:sz w:val="22"/>
+          <w:szCs w:val="22"/>
+        </w:rPr>
+        <w:t xml:space="preserve">La conversación que originalmente falló: se pide el tema, el estudiante insiste y luego solicita el enlace. Ada mantiene el tema y entrega los enlaces de los cursos mostrados.</w:t>
+      </w:r>
+    </w:p>
+    <w:p>
+      <w:pPr>
+        <w:spacing w:after="60" w:before="160"/>
+        <w:jc w:val="center"/>
+      </w:pPr>
+      <w:r>
+        <w:drawing>
+          <wp:inline distT="0" distB="0" distL="0" distR="0">
+            <wp:extent cx="4000500" cy="4524375"/>
+            <wp:effectExtent t="0" r="0" b="0" l="0"/>
+            <wp:docPr id="33" name="" descr="" title=""/>
+            <wp:cNvGraphicFramePr>
+              <a:graphicFrameLocks xmlns:a="http://schemas.openxmlformats.org/drawingml/2006/main" noChangeAspect="1"/>
+            </wp:cNvGraphicFramePr>
+            <a:graphic xmlns:a="http://schemas.openxmlformats.org/drawingml/2006/main">
+              <a:graphicData uri="http://schemas.openxmlformats.org/drawingml/2006/picture">
+                <pic:pic xmlns:pic="http://schemas.openxmlformats.org/drawingml/2006/picture">
+                  <pic:nvPicPr>
+                    <pic:cNvPr id="0" name="" descr=""/>
+                    <pic:cNvPicPr>
+                      <a:picLocks noChangeAspect="1" noChangeArrowheads="1"/>
+                    </pic:cNvPicPr>
+                  </pic:nvPicPr>
+                  <pic:blipFill>
+                    <a:blip r:embed="rId41" cstate="none"/>
+                    <a:srcRect/>
+                    <a:stretch>
+                      <a:fillRect/>
+                    </a:stretch>
+                  </pic:blipFill>
+                  <pic:spPr bwMode="auto">
+                    <a:xfrm>
+                      <a:off x="0" y="0"/>
+                      <a:ext cx="4000500" cy="4524375"/>
+                    </a:xfrm>
+                    <a:prstGeom prst="rect">
+                      <a:avLst/>
+                    </a:prstGeom>
+                  </pic:spPr>
+                </pic:pic>
+              </a:graphicData>
+            </a:graphic>
+          </wp:inline>
+        </w:drawing>
+      </w:r>
+    </w:p>
+    <w:p>
+      <w:pPr>
+        <w:spacing w:after="220"/>
+        <w:jc w:val="center"/>
+      </w:pPr>
+      <w:r>
+        <w:rPr>
+          <w:rFonts w:ascii="Calibri" w:cs="Calibri" w:eastAsia="Calibri" w:hAnsi="Calibri"/>
+          <w:i/>
+          <w:iCs/>
+          <w:color w:val="6B7A82"/>
+          <w:sz w:val="19"/>
+          <w:szCs w:val="19"/>
+        </w:rPr>
+        <w:t xml:space="preserve">Conversación: tema, insistencia y solicitud de enlace; la respuesta trae los enlaces clicables.</w:t>
+      </w:r>
+    </w:p>
+    <w:p>
+      <w:pPr>
+        <w:pStyle w:val="Heading2"/>
+        <w:spacing w:after="140" w:before="320"/>
+      </w:pPr>
+      <w:r>
+        <w:rPr>
+          <w:rFonts w:ascii="Calibri" w:cs="Calibri" w:eastAsia="Calibri" w:hAnsi="Calibri"/>
+          <w:b/>
+          <w:bCs/>
+          <w:color w:val="4E95C2"/>
+          <w:sz w:val="24"/>
+          <w:szCs w:val="24"/>
+        </w:rPr>
+        <w:t xml:space="preserve">Catálogo grande y detalle de un curso (B12, B13)</w:t>
+      </w:r>
+    </w:p>
+    <w:p>
+      <w:pPr>
+        <w:spacing w:after="160" w:line="288"/>
+        <w:jc w:val="both"/>
+      </w:pPr>
+      <w:r>
+        <w:rPr>
+          <w:rFonts w:ascii="Calibri" w:cs="Calibri" w:eastAsia="Calibri" w:hAnsi="Calibri"/>
+          <w:b w:val="false"/>
+          <w:bCs w:val="false"/>
+          <w:i w:val="false"/>
+          <w:iCs w:val="false"/>
+          <w:color w:val="222222"/>
+          <w:sz w:val="22"/>
+          <w:szCs w:val="22"/>
+        </w:rPr>
+        <w:t xml:space="preserve">Con 1.002 cursos, el listado muestra el total y las categorías en lugar de listar todos los cursos; el detalle de un curso conserva las unidades, los pesos y agrega el enlace.</w:t>
+      </w:r>
+    </w:p>
+    <w:p>
+      <w:pPr>
+        <w:spacing w:after="60" w:before="160"/>
+        <w:jc w:val="center"/>
+      </w:pPr>
+      <w:r>
+        <w:drawing>
+          <wp:inline distT="0" distB="0" distL="0" distR="0">
+            <wp:extent cx="4000500" cy="4524375"/>
+            <wp:effectExtent t="0" r="0" b="0" l="0"/>
+            <wp:docPr id="34" name="" descr="" title=""/>
+            <wp:cNvGraphicFramePr>
+              <a:graphicFrameLocks xmlns:a="http://schemas.openxmlformats.org/drawingml/2006/main" noChangeAspect="1"/>
+            </wp:cNvGraphicFramePr>
+            <a:graphic xmlns:a="http://schemas.openxmlformats.org/drawingml/2006/main">
+              <a:graphicData uri="http://schemas.openxmlformats.org/drawingml/2006/picture">
+                <pic:pic xmlns:pic="http://schemas.openxmlformats.org/drawingml/2006/picture">
+                  <pic:nvPicPr>
+                    <pic:cNvPr id="0" name="" descr=""/>
+                    <pic:cNvPicPr>
+                      <a:picLocks noChangeAspect="1" noChangeArrowheads="1"/>
+                    </pic:cNvPicPr>
+                  </pic:nvPicPr>
+                  <pic:blipFill>
+                    <a:blip r:embed="rId42" cstate="none"/>
+                    <a:srcRect/>
+                    <a:stretch>
+                      <a:fillRect/>
+                    </a:stretch>
+                  </pic:blipFill>
+                  <pic:spPr bwMode="auto">
+                    <a:xfrm>
+                      <a:off x="0" y="0"/>
+                      <a:ext cx="4000500" cy="4524375"/>
+                    </a:xfrm>
+                    <a:prstGeom prst="rect">
+                      <a:avLst/>
+                    </a:prstGeom>
+                  </pic:spPr>
+                </pic:pic>
+              </a:graphicData>
+            </a:graphic>
+          </wp:inline>
+        </w:drawing>
+      </w:r>
+    </w:p>
+    <w:p>
+      <w:pPr>
+        <w:spacing w:after="220"/>
+        <w:jc w:val="center"/>
+      </w:pPr>
+      <w:r>
+        <w:rPr>
+          <w:rFonts w:ascii="Calibri" w:cs="Calibri" w:eastAsia="Calibri" w:hAnsi="Calibri"/>
+          <w:i/>
+          <w:iCs/>
+          <w:color w:val="6B7A82"/>
+          <w:sz w:val="19"/>
+          <w:szCs w:val="19"/>
+        </w:rPr>
+        <w:t xml:space="preserve">Panorama del catálogo (1.002 cursos, 18 categorías) y detalle de Ciencias Naturales.</w:t>
+      </w:r>
+    </w:p>
+    <w:p>
+      <w:pPr>
+        <w:pStyle w:val="Heading2"/>
+        <w:spacing w:after="140" w:before="320"/>
+      </w:pPr>
+      <w:r>
+        <w:rPr>
+          <w:rFonts w:ascii="Calibri" w:cs="Calibri" w:eastAsia="Calibri" w:hAnsi="Calibri"/>
+          <w:b/>
+          <w:bCs/>
+          <w:color w:val="4E95C2"/>
+          <w:sz w:val="24"/>
+          <w:szCs w:val="24"/>
+        </w:rPr>
+        <w:t xml:space="preserve">Tema inexistente (B6)</w:t>
+      </w:r>
+    </w:p>
+    <w:p>
+      <w:pPr>
+        <w:spacing w:after="160" w:line="288"/>
+        <w:jc w:val="both"/>
+      </w:pPr>
+      <w:r>
+        <w:rPr>
+          <w:rFonts w:ascii="Calibri" w:cs="Calibri" w:eastAsia="Calibri" w:hAnsi="Calibri"/>
+          <w:b w:val="false"/>
+          <w:bCs w:val="false"/>
+          <w:i w:val="false"/>
+          <w:iCs w:val="false"/>
+          <w:color w:val="222222"/>
+          <w:sz w:val="22"/>
+          <w:szCs w:val="22"/>
+        </w:rPr>
+        <w:t xml:space="preserve">Ante un tema que no existe en el catálogo, Ada informa que no encontró coincidencias en vez de inventar cursos.</w:t>
+      </w:r>
+    </w:p>
+    <w:p>
+      <w:pPr>
+        <w:spacing w:after="60" w:before="160"/>
+        <w:jc w:val="center"/>
+      </w:pPr>
+      <w:r>
+        <w:drawing>
+          <wp:inline distT="0" distB="0" distL="0" distR="0">
+            <wp:extent cx="4000500" cy="4524375"/>
+            <wp:effectExtent t="0" r="0" b="0" l="0"/>
+            <wp:docPr id="35" name="" descr="" title=""/>
+            <wp:cNvGraphicFramePr>
+              <a:graphicFrameLocks xmlns:a="http://schemas.openxmlformats.org/drawingml/2006/main" noChangeAspect="1"/>
+            </wp:cNvGraphicFramePr>
+            <a:graphic xmlns:a="http://schemas.openxmlformats.org/drawingml/2006/main">
+              <a:graphicData uri="http://schemas.openxmlformats.org/drawingml/2006/picture">
+                <pic:pic xmlns:pic="http://schemas.openxmlformats.org/drawingml/2006/picture">
+                  <pic:nvPicPr>
+                    <pic:cNvPr id="0" name="" descr=""/>
+                    <pic:cNvPicPr>
+                      <a:picLocks noChangeAspect="1" noChangeArrowheads="1"/>
+                    </pic:cNvPicPr>
+                  </pic:nvPicPr>
+                  <pic:blipFill>
+                    <a:blip r:embed="rId43" cstate="none"/>
                     <a:srcRect/>
                     <a:stretch>
                       <a:fillRect/>

</xml_diff>